<commit_message>
Remove redundant AI draft documents
</commit_message>
<xml_diff>
--- a/LVTN/NguyenAnNam_DH52201078.docx
+++ b/LVTN/NguyenAnNam_DH52201078.docx
@@ -6781,10 +6781,10 @@
           <w:noProof/>
         </w:rPr>
         <w:drawing>
-          <wp:inline distT="0" distB="0" distL="0" distR="0" wp14:anchorId="76921E7C" wp14:editId="5EA87E78">
-            <wp:extent cx="5806440" cy="3649762"/>
-            <wp:effectExtent l="0" t="0" r="0" b="0"/>
-            <wp:docPr id="2021908890" name="Picture 2021908890"/>
+          <wp:inline distT="0" distB="0" distL="0" distR="0" wp14:anchorId="7DF1254B" wp14:editId="5EA9511D">
+            <wp:extent cx="5748655" cy="3232150"/>
+            <wp:effectExtent l="0" t="0" r="4445" b="6350"/>
+            <wp:docPr id="1152087875" name="Picture 5"/>
             <wp:cNvGraphicFramePr>
               <a:graphicFrameLocks xmlns:a="http://schemas.openxmlformats.org/drawingml/2006/main" noChangeAspect="1"/>
             </wp:cNvGraphicFramePr>
@@ -6792,23 +6792,36 @@
               <a:graphicData uri="http://schemas.openxmlformats.org/drawingml/2006/picture">
                 <pic:pic xmlns:pic="http://schemas.openxmlformats.org/drawingml/2006/picture">
                   <pic:nvPicPr>
-                    <pic:cNvPr id="0" name="fig_2_1_architecture.png"/>
-                    <pic:cNvPicPr/>
+                    <pic:cNvPr id="0" name="Picture 1"/>
+                    <pic:cNvPicPr>
+                      <a:picLocks noChangeAspect="1" noChangeArrowheads="1"/>
+                    </pic:cNvPicPr>
                   </pic:nvPicPr>
                   <pic:blipFill>
-                    <a:blip r:embed="rId13"/>
+                    <a:blip r:embed="rId13" cstate="print">
+                      <a:extLst>
+                        <a:ext uri="{28A0092B-C50C-407E-A947-70E740481C1C}">
+                          <a14:useLocalDpi xmlns:a14="http://schemas.microsoft.com/office/drawing/2010/main" val="0"/>
+                        </a:ext>
+                      </a:extLst>
+                    </a:blip>
+                    <a:srcRect/>
                     <a:stretch>
                       <a:fillRect/>
                     </a:stretch>
                   </pic:blipFill>
-                  <pic:spPr>
+                  <pic:spPr bwMode="auto">
                     <a:xfrm>
                       <a:off x="0" y="0"/>
-                      <a:ext cx="5806440" cy="3649762"/>
+                      <a:ext cx="5748655" cy="3232150"/>
                     </a:xfrm>
                     <a:prstGeom prst="rect">
                       <a:avLst/>
                     </a:prstGeom>
+                    <a:noFill/>
+                    <a:ln>
+                      <a:noFill/>
+                    </a:ln>
                   </pic:spPr>
                 </pic:pic>
               </a:graphicData>
@@ -6849,9 +6862,9 @@
         <w:tblLook w:val="04A0" w:firstRow="1" w:lastRow="0" w:firstColumn="1" w:lastColumn="0" w:noHBand="0" w:noVBand="1"/>
       </w:tblPr>
       <w:tblGrid>
-        <w:gridCol w:w="1274"/>
-        <w:gridCol w:w="3485"/>
-        <w:gridCol w:w="4302"/>
+        <w:gridCol w:w="1273"/>
+        <w:gridCol w:w="3023"/>
+        <w:gridCol w:w="4765"/>
       </w:tblGrid>
       <w:tr>
         <w:trPr>
@@ -6966,7 +6979,7 @@
               <w:rPr>
                 <w:rFonts w:cs="Times New Roman"/>
               </w:rPr>
-              <w:t>ASP.NET Core Web API .NET 10</w:t>
+              <w:t>ASP.NET Core Web API (.NET 10)</w:t>
             </w:r>
           </w:p>
         </w:tc>
@@ -6985,7 +6998,7 @@
               <w:rPr>
                 <w:rFonts w:cs="Times New Roman"/>
               </w:rPr>
-              <w:t>Xây dựng REST API, xác thực, phân quyền, xử lý nghiệp vụ và kết nối cơ sở dữ liệu.</w:t>
+              <w:t>Xây dựng API, xác thực, phân quyền, xử lý nghiệp vụ và kết nối cơ sở dữ liệu.</w:t>
             </w:r>
           </w:p>
         </w:tc>
@@ -7047,7 +7060,7 @@
               <w:rPr>
                 <w:rFonts w:cs="Times New Roman"/>
               </w:rPr>
-              <w:t>Xây dựng giao diện web tương tác, bảng dữ liệu, form nhập liệu, tab nghiệp vụ và thông báo.</w:t>
+              <w:t>Xây dựng giao diện web tương tác, bảng dữ liệu, form nhập liệu, tab nghiệp vụ và thông báo người dùng.</w:t>
             </w:r>
           </w:p>
         </w:tc>
@@ -7109,7 +7122,7 @@
               <w:rPr>
                 <w:rFonts w:cs="Times New Roman"/>
               </w:rPr>
-              <w:t>Lưu trữ dữ liệu nghiệp vụ, ánh xạ model, migration, ràng buộc và truy vấn tổng hợp.</w:t>
+              <w:t>Lưu trữ dữ liệu nghiệp vụ; hỗ trợ ánh xạ model, migration, ràng buộc dữ liệu và truy vấn tổng hợp.</w:t>
             </w:r>
           </w:p>
         </w:tc>
@@ -7152,20 +7165,7 @@
               <w:rPr>
                 <w:rFonts w:cs="Times New Roman"/>
               </w:rPr>
-              <w:t>JWT Bearer, cookie đăng nhập frontend, policy authorization</w:t>
-            </w:r>
-            <w:r>
-              <w:rPr>
-                <w:rFonts w:cs="Times New Roman"/>
-                <w:lang w:val="en-US"/>
-              </w:rPr>
-              <w:t xml:space="preserve"> </w:t>
-            </w:r>
-            <w:r>
-              <w:rPr>
-                <w:rFonts w:cs="Times New Roman"/>
-              </w:rPr>
-              <w:t>(Policy-based Authorization)</w:t>
+              <w:t>JWT Bearer, cookie đăng nhập frontend, Policy-based Authorization</w:t>
             </w:r>
           </w:p>
         </w:tc>
@@ -7184,26 +7184,7 @@
               <w:rPr>
                 <w:rFonts w:cs="Times New Roman"/>
               </w:rPr>
-              <w:t>Xác thực người dùng và kiểm soát quyền theo mã chức năng</w:t>
-            </w:r>
-            <w:r>
-              <w:rPr>
-                <w:rFonts w:cs="Times New Roman"/>
-              </w:rPr>
-              <w:t xml:space="preserve"> (phân quyền dựa tr</w:t>
-            </w:r>
-            <w:r>
-              <w:rPr>
-                <w:rFonts w:cs="Times New Roman"/>
-                <w:lang w:val="en-US"/>
-              </w:rPr>
-              <w:t>ên chính sách)</w:t>
-            </w:r>
-            <w:r>
-              <w:rPr>
-                <w:rFonts w:cs="Times New Roman"/>
-              </w:rPr>
-              <w:t>.</w:t>
+              <w:t>Xác thực người dùng, duy trì phiên đăng nhập phía frontend và kiểm soát quyền theo mã chức năng.</w:t>
             </w:r>
           </w:p>
         </w:tc>
@@ -7265,33 +7246,7 @@
               <w:rPr>
                 <w:rFonts w:cs="Times New Roman"/>
               </w:rPr>
-              <w:t xml:space="preserve">Chuyển đổi giữa entity và DTO, </w:t>
-            </w:r>
-            <w:r>
-              <w:rPr>
-                <w:rFonts w:cs="Times New Roman"/>
-                <w:lang w:val="en-US"/>
-              </w:rPr>
-              <w:t>hạn chế trùng</w:t>
-            </w:r>
-            <w:r>
-              <w:rPr>
-                <w:rFonts w:cs="Times New Roman"/>
-              </w:rPr>
-              <w:t xml:space="preserve"> lặp mã</w:t>
-            </w:r>
-            <w:r>
-              <w:rPr>
-                <w:rFonts w:cs="Times New Roman"/>
-                <w:lang w:val="en-US"/>
-              </w:rPr>
-              <w:t xml:space="preserve"> nguồn</w:t>
-            </w:r>
-            <w:r>
-              <w:rPr>
-                <w:rFonts w:cs="Times New Roman"/>
-              </w:rPr>
-              <w:t xml:space="preserve"> trong controller/service.</w:t>
+              <w:t>Chuyển đổi giữa entity và DTO, giảm trùng lặp mã nguồn trong controller/service.</w:t>
             </w:r>
           </w:p>
         </w:tc>
@@ -7315,7 +7270,6 @@
               <w:rPr>
                 <w:rFonts w:cs="Times New Roman"/>
               </w:rPr>
-              <w:lastRenderedPageBreak/>
               <w:t>Ghi log</w:t>
             </w:r>
           </w:p>
@@ -7354,20 +7308,7 @@
               <w:rPr>
                 <w:rFonts w:cs="Times New Roman"/>
               </w:rPr>
-              <w:t xml:space="preserve">Ghi log hệ thống và lưu </w:t>
-            </w:r>
-            <w:r>
-              <w:rPr>
-                <w:rFonts w:cs="Times New Roman"/>
-                <w:lang w:val="en-US"/>
-              </w:rPr>
-              <w:t>lịch sử hoạt động</w:t>
-            </w:r>
-            <w:r>
-              <w:rPr>
-                <w:rFonts w:cs="Times New Roman"/>
-              </w:rPr>
-              <w:t xml:space="preserve"> nghiệp vụ cho các thao tác quan trọng.</w:t>
+              <w:t>Ghi log hệ thống và lưu lịch sử thao tác nghiệp vụ quan trọng.</w:t>
             </w:r>
           </w:p>
         </w:tc>
@@ -7391,6 +7332,7 @@
               <w:rPr>
                 <w:rFonts w:cs="Times New Roman"/>
               </w:rPr>
+              <w:lastRenderedPageBreak/>
               <w:t>Triển khai</w:t>
             </w:r>
           </w:p>
@@ -7429,20 +7371,7 @@
               <w:rPr>
                 <w:rFonts w:cs="Times New Roman"/>
               </w:rPr>
-              <w:t xml:space="preserve">Đóng gói SQL Server, backend, frontend và </w:t>
-            </w:r>
-            <w:r>
-              <w:rPr>
-                <w:rFonts w:cs="Times New Roman"/>
-                <w:lang w:val="en-US"/>
-              </w:rPr>
-              <w:t>hỗ trợ tự động hoá việc</w:t>
-            </w:r>
-            <w:r>
-              <w:rPr>
-                <w:rFonts w:cs="Times New Roman"/>
-              </w:rPr>
-              <w:t xml:space="preserve"> triển khai lên máy chủ.</w:t>
+              <w:t>Đóng gói SQL Server, backend, frontend; định tuyến, reverse proxy, SSL termination và hỗ trợ triển khai lên máy chủ.</w:t>
             </w:r>
           </w:p>
         </w:tc>
@@ -7808,8 +7737,15 @@
           <w:rFonts w:cs="Times New Roman"/>
           <w:lang w:val="en-GB"/>
         </w:rPr>
+        <w:t xml:space="preserve">- Nếu xác thực thành công, Backend tạo token JWT có thời hạn 24 giờ, chứa các thông tin quan trọng của người dùng gồm: mã người dùng (UserID), tên đăng nhập, tên đầy </w:t>
+      </w:r>
+      <w:r>
+        <w:rPr>
+          <w:rFonts w:cs="Times New Roman"/>
+          <w:lang w:val="en-GB"/>
+        </w:rPr>
         <w:lastRenderedPageBreak/>
-        <w:t>- Nếu xác thực thành công, Backend tạo token JWT có thời hạn 24 giờ, chứa các thông tin quan trọng của người dùng gồm: mã người dùng (UserID), tên đăng nhập, tên đầy đủ, mã nhóm quyền (GroupId), mã phòng ban (DepartmentCode) và vai trò quản trị (IsAdmin).</w:t>
+        <w:t>đủ, mã nhóm quyền (GroupId), mã phòng ban (DepartmentCode) và vai trò quản trị (IsAdmin).</w:t>
       </w:r>
     </w:p>
     <w:p>
@@ -8133,22 +8069,22 @@
           <w:rFonts w:cs="Times New Roman"/>
           <w:lang w:val="en-GB"/>
         </w:rPr>
+        <w:t>- Nếu đã qua thời hạn chốt, hệ thống thông báo "Đã quá hạn gửi đơn cho kỳ này" và không cho phép tạo đơn thông thường.</w:t>
+      </w:r>
+    </w:p>
+    <w:p>
+      <w:pPr>
+        <w:rPr>
+          <w:rFonts w:cs="Times New Roman"/>
+          <w:lang w:val="en-GB"/>
+        </w:rPr>
+      </w:pPr>
+      <w:r>
+        <w:rPr>
+          <w:rFonts w:cs="Times New Roman"/>
+          <w:lang w:val="en-GB"/>
+        </w:rPr>
         <w:lastRenderedPageBreak/>
-        <w:t>- Nếu đã qua thời hạn chốt, hệ thống thông báo "Đã quá hạn gửi đơn cho kỳ này" và không cho phép tạo đơn thông thường.</w:t>
-      </w:r>
-    </w:p>
-    <w:p>
-      <w:pPr>
-        <w:rPr>
-          <w:rFonts w:cs="Times New Roman"/>
-          <w:lang w:val="en-GB"/>
-        </w:rPr>
-      </w:pPr>
-      <w:r>
-        <w:rPr>
-          <w:rFonts w:cs="Times New Roman"/>
-          <w:lang w:val="en-GB"/>
-        </w:rPr>
         <w:t>- Nếu người dùng đã có đơn thông thường trong kỳ này, hệ thống thông báo "Bạn đã có đơn cho kỳ này" và chặn tạo thêm.</w:t>
       </w:r>
     </w:p>
@@ -8395,7 +8331,6 @@
           <w:rFonts w:cs="Times New Roman"/>
           <w:lang w:val="en-GB"/>
         </w:rPr>
-        <w:lastRenderedPageBreak/>
         <w:t>- Toàn bộ các thao tác trên được thực hiện trong cùng một giao dịch cơ sở dữ liệu (Transaction). Nếu bất kỳ bước nào thất bại, toàn bộ dữ liệu sẽ được hoàn tác (Rollback).</w:t>
       </w:r>
     </w:p>
@@ -8412,6 +8347,7 @@
           <w:u w:val="none"/>
           <w:lang w:val="en-US"/>
         </w:rPr>
+        <w:lastRenderedPageBreak/>
         <w:t>2.3.1.3 Quy trình tạo và phê duyệt đơn bổ sung</w:t>
       </w:r>
     </w:p>
@@ -8752,22 +8688,22 @@
           <w:rFonts w:cs="Times New Roman"/>
           <w:lang w:val="en-GB"/>
         </w:rPr>
+        <w:t>- Phê duyệt: Hệ thống chuyển trạng thái từ "Chờ duyệt" sang "Đã duyệt" (Approved), ghi nhận mã người duyệt và thời điểm duyệt.</w:t>
+      </w:r>
+    </w:p>
+    <w:p>
+      <w:pPr>
+        <w:rPr>
+          <w:rFonts w:cs="Times New Roman"/>
+          <w:lang w:val="en-GB"/>
+        </w:rPr>
+      </w:pPr>
+      <w:r>
+        <w:rPr>
+          <w:rFonts w:cs="Times New Roman"/>
+          <w:lang w:val="en-GB"/>
+        </w:rPr>
         <w:lastRenderedPageBreak/>
-        <w:t>- Phê duyệt: Hệ thống chuyển trạng thái từ "Chờ duyệt" sang "Đã duyệt" (Approved), ghi nhận mã người duyệt và thời điểm duyệt.</w:t>
-      </w:r>
-    </w:p>
-    <w:p>
-      <w:pPr>
-        <w:rPr>
-          <w:rFonts w:cs="Times New Roman"/>
-          <w:lang w:val="en-GB"/>
-        </w:rPr>
-      </w:pPr>
-      <w:r>
-        <w:rPr>
-          <w:rFonts w:cs="Times New Roman"/>
-          <w:lang w:val="en-GB"/>
-        </w:rPr>
         <w:t>- Từ chối: Quản trị viên có thể nhập lý do từ chối. Hệ thống chuyển trạng thái sang "Bị từ chối" (Rejected), ghi nhận lý do, mã người từ chối và thời điểm từ chối.</w:t>
       </w:r>
     </w:p>
@@ -12085,6 +12021,60 @@
           <w:rFonts w:cs="Times New Roman"/>
         </w:rPr>
       </w:pPr>
+      <w:r>
+        <w:rPr>
+          <w:rFonts w:cs="Times New Roman"/>
+          <w:noProof/>
+        </w:rPr>
+        <w:drawing>
+          <wp:inline distT="0" distB="0" distL="0" distR="0" wp14:anchorId="597354A3" wp14:editId="146113A2">
+            <wp:extent cx="5753100" cy="4070350"/>
+            <wp:effectExtent l="0" t="0" r="0" b="6350"/>
+            <wp:docPr id="112067318" name="Picture 6"/>
+            <wp:cNvGraphicFramePr>
+              <a:graphicFrameLocks xmlns:a="http://schemas.openxmlformats.org/drawingml/2006/main" noChangeAspect="1"/>
+            </wp:cNvGraphicFramePr>
+            <a:graphic xmlns:a="http://schemas.openxmlformats.org/drawingml/2006/main">
+              <a:graphicData uri="http://schemas.openxmlformats.org/drawingml/2006/picture">
+                <pic:pic xmlns:pic="http://schemas.openxmlformats.org/drawingml/2006/picture">
+                  <pic:nvPicPr>
+                    <pic:cNvPr id="0" name="Picture 2"/>
+                    <pic:cNvPicPr>
+                      <a:picLocks noChangeAspect="1" noChangeArrowheads="1"/>
+                    </pic:cNvPicPr>
+                  </pic:nvPicPr>
+                  <pic:blipFill>
+                    <a:blip r:embed="rId14" cstate="print">
+                      <a:extLst>
+                        <a:ext uri="{28A0092B-C50C-407E-A947-70E740481C1C}">
+                          <a14:useLocalDpi xmlns:a14="http://schemas.microsoft.com/office/drawing/2010/main" val="0"/>
+                        </a:ext>
+                      </a:extLst>
+                    </a:blip>
+                    <a:srcRect/>
+                    <a:stretch>
+                      <a:fillRect/>
+                    </a:stretch>
+                  </pic:blipFill>
+                  <pic:spPr bwMode="auto">
+                    <a:xfrm>
+                      <a:off x="0" y="0"/>
+                      <a:ext cx="5753100" cy="4070350"/>
+                    </a:xfrm>
+                    <a:prstGeom prst="rect">
+                      <a:avLst/>
+                    </a:prstGeom>
+                    <a:noFill/>
+                    <a:ln>
+                      <a:noFill/>
+                    </a:ln>
+                  </pic:spPr>
+                </pic:pic>
+              </a:graphicData>
+            </a:graphic>
+          </wp:inline>
+        </w:drawing>
+      </w:r>
     </w:p>
     <w:p>
       <w:pPr>
@@ -12117,6 +12107,7 @@
       </w:pPr>
       <w:bookmarkStart w:id="23" w:name="_Toc233531575"/>
       <w:r>
+        <w:lastRenderedPageBreak/>
         <w:t>2.3.3 Sơ đồ Use case tổng quát</w:t>
       </w:r>
       <w:bookmarkEnd w:id="23"/>
@@ -12130,6 +12121,60 @@
           <w:rFonts w:cs="Times New Roman"/>
         </w:rPr>
       </w:pPr>
+      <w:r>
+        <w:rPr>
+          <w:rFonts w:cs="Times New Roman"/>
+          <w:noProof/>
+        </w:rPr>
+        <w:drawing>
+          <wp:inline distT="0" distB="0" distL="0" distR="0" wp14:anchorId="08AEEE94" wp14:editId="7F611D6A">
+            <wp:extent cx="5762625" cy="4057650"/>
+            <wp:effectExtent l="0" t="0" r="9525" b="0"/>
+            <wp:docPr id="1340595098" name="Picture 9"/>
+            <wp:cNvGraphicFramePr>
+              <a:graphicFrameLocks xmlns:a="http://schemas.openxmlformats.org/drawingml/2006/main" noChangeAspect="1"/>
+            </wp:cNvGraphicFramePr>
+            <a:graphic xmlns:a="http://schemas.openxmlformats.org/drawingml/2006/main">
+              <a:graphicData uri="http://schemas.openxmlformats.org/drawingml/2006/picture">
+                <pic:pic xmlns:pic="http://schemas.openxmlformats.org/drawingml/2006/picture">
+                  <pic:nvPicPr>
+                    <pic:cNvPr id="0" name="Picture 13"/>
+                    <pic:cNvPicPr>
+                      <a:picLocks noChangeAspect="1" noChangeArrowheads="1"/>
+                    </pic:cNvPicPr>
+                  </pic:nvPicPr>
+                  <pic:blipFill>
+                    <a:blip r:embed="rId15" cstate="print">
+                      <a:extLst>
+                        <a:ext uri="{28A0092B-C50C-407E-A947-70E740481C1C}">
+                          <a14:useLocalDpi xmlns:a14="http://schemas.microsoft.com/office/drawing/2010/main" val="0"/>
+                        </a:ext>
+                      </a:extLst>
+                    </a:blip>
+                    <a:srcRect/>
+                    <a:stretch>
+                      <a:fillRect/>
+                    </a:stretch>
+                  </pic:blipFill>
+                  <pic:spPr bwMode="auto">
+                    <a:xfrm>
+                      <a:off x="0" y="0"/>
+                      <a:ext cx="5762625" cy="4057650"/>
+                    </a:xfrm>
+                    <a:prstGeom prst="rect">
+                      <a:avLst/>
+                    </a:prstGeom>
+                    <a:noFill/>
+                    <a:ln>
+                      <a:noFill/>
+                    </a:ln>
+                  </pic:spPr>
+                </pic:pic>
+              </a:graphicData>
+            </a:graphic>
+          </wp:inline>
+        </w:drawing>
+      </w:r>
     </w:p>
     <w:p>
       <w:pPr>
@@ -12248,12 +12293,10 @@
         <w:tc>
           <w:tcPr>
             <w:tcW w:w="1701" w:type="dxa"/>
-            <w:vAlign w:val="center"/>
           </w:tcPr>
           <w:p>
             <w:pPr>
               <w:spacing w:after="60"/>
-              <w:jc w:val="center"/>
               <w:rPr>
                 <w:rFonts w:cs="Times New Roman"/>
               </w:rPr>
@@ -12269,7 +12312,6 @@
         <w:tc>
           <w:tcPr>
             <w:tcW w:w="2381" w:type="dxa"/>
-            <w:vAlign w:val="center"/>
           </w:tcPr>
           <w:p>
             <w:pPr>
@@ -12282,14 +12324,13 @@
               <w:rPr>
                 <w:rFonts w:cs="Times New Roman"/>
               </w:rPr>
-              <w:t>Người dùng tạo yêu cầu văn phòng phẩm cho cá nhân/phòng ban.</w:t>
+              <w:t>Người dùng tạo và theo dõi yêu cầu văn phòng phẩm cho cá nhân/phòng ban.</w:t>
             </w:r>
           </w:p>
         </w:tc>
         <w:tc>
           <w:tcPr>
             <w:tcW w:w="4082" w:type="dxa"/>
-            <w:vAlign w:val="center"/>
           </w:tcPr>
           <w:p>
             <w:pPr>
@@ -12302,7 +12343,7 @@
               <w:rPr>
                 <w:rFonts w:cs="Times New Roman"/>
               </w:rPr>
-              <w:t>Đăng nhập, xem danh mục, tạo đơn, sửa đơn, hủy đơn, xem lịch sử, sao chép đơn kỳ trước.</w:t>
+              <w:t>Đăng nhập, xem danh mục, tạo đơn, sửa đơn, hủy đơn, xem lịch sử, sao chép đơn kỳ trước, tạo đơn bổ sung.</w:t>
             </w:r>
           </w:p>
         </w:tc>
@@ -12314,12 +12355,10 @@
         <w:tc>
           <w:tcPr>
             <w:tcW w:w="1701" w:type="dxa"/>
-            <w:vAlign w:val="center"/>
           </w:tcPr>
           <w:p>
             <w:pPr>
               <w:spacing w:after="60"/>
-              <w:jc w:val="center"/>
               <w:rPr>
                 <w:rFonts w:cs="Times New Roman"/>
               </w:rPr>
@@ -12335,7 +12374,6 @@
         <w:tc>
           <w:tcPr>
             <w:tcW w:w="2381" w:type="dxa"/>
-            <w:vAlign w:val="center"/>
           </w:tcPr>
           <w:p>
             <w:pPr>
@@ -12348,14 +12386,13 @@
               <w:rPr>
                 <w:rFonts w:cs="Times New Roman"/>
               </w:rPr>
-              <w:t>Người theo dõi nhu cầu theo phòng ban.</w:t>
+              <w:t>Người theo dõi nhu cầu văn phòng phẩm theo phạm vi phòng ban.</w:t>
             </w:r>
           </w:p>
         </w:tc>
         <w:tc>
           <w:tcPr>
             <w:tcW w:w="4082" w:type="dxa"/>
-            <w:vAlign w:val="center"/>
           </w:tcPr>
           <w:p>
             <w:pPr>
@@ -12380,12 +12417,10 @@
         <w:tc>
           <w:tcPr>
             <w:tcW w:w="1701" w:type="dxa"/>
-            <w:vAlign w:val="center"/>
           </w:tcPr>
           <w:p>
             <w:pPr>
               <w:spacing w:after="60"/>
-              <w:jc w:val="center"/>
               <w:rPr>
                 <w:rFonts w:cs="Times New Roman"/>
               </w:rPr>
@@ -12401,7 +12436,6 @@
         <w:tc>
           <w:tcPr>
             <w:tcW w:w="2381" w:type="dxa"/>
-            <w:vAlign w:val="center"/>
           </w:tcPr>
           <w:p>
             <w:pPr>
@@ -12414,14 +12448,13 @@
               <w:rPr>
                 <w:rFonts w:cs="Times New Roman"/>
               </w:rPr>
-              <w:t>Người quản lý dữ liệu nền, quyền và xử lý nghiệp vụ cuối kỳ.</w:t>
+              <w:t>Người quản lý dữ liệu nền, phân quyền và xử lý nghiệp vụ cuối kỳ.</w:t>
             </w:r>
           </w:p>
         </w:tc>
         <w:tc>
           <w:tcPr>
             <w:tcW w:w="4082" w:type="dxa"/>
-            <w:vAlign w:val="center"/>
           </w:tcPr>
           <w:p>
             <w:pPr>
@@ -12434,7 +12467,7 @@
               <w:rPr>
                 <w:rFonts w:cs="Times New Roman"/>
               </w:rPr>
-              <w:t>Quản lý danh mục, bảng giá, duyệt đơn bổ sung, đóng kỳ, phân quyền, xem tổng hợp toàn doanh nghiệp.</w:t>
+              <w:t>Quản lý danh mục, quản lý bảng giá, duyệt đơn bổ sung, đóng kỳ, phân quyền, xem tổng hợp toàn doanh nghiệp.</w:t>
             </w:r>
           </w:p>
         </w:tc>
@@ -12446,12 +12479,10 @@
         <w:tc>
           <w:tcPr>
             <w:tcW w:w="1701" w:type="dxa"/>
-            <w:vAlign w:val="center"/>
           </w:tcPr>
           <w:p>
             <w:pPr>
               <w:spacing w:after="60"/>
-              <w:jc w:val="center"/>
               <w:rPr>
                 <w:rFonts w:cs="Times New Roman"/>
               </w:rPr>
@@ -12460,14 +12491,13 @@
               <w:rPr>
                 <w:rFonts w:cs="Times New Roman"/>
               </w:rPr>
-              <w:t>Hệ thống</w:t>
+              <w:t>Tác vụ hệ thống</w:t>
             </w:r>
           </w:p>
         </w:tc>
         <w:tc>
           <w:tcPr>
             <w:tcW w:w="2381" w:type="dxa"/>
-            <w:vAlign w:val="center"/>
           </w:tcPr>
           <w:p>
             <w:pPr>
@@ -12480,26 +12510,19 @@
               <w:rPr>
                 <w:rFonts w:cs="Times New Roman"/>
               </w:rPr>
-              <w:t>Thành phần tự động tính toán và kiểm tra ràng buộc.</w:t>
+              <w:t>Các xử lý tự động hỗ trợ kiểm tra và ghi nhận nghiệp vụ.</w:t>
             </w:r>
           </w:p>
         </w:tc>
         <w:tc>
           <w:tcPr>
             <w:tcW w:w="4082" w:type="dxa"/>
-            <w:vAlign w:val="center"/>
           </w:tcPr>
           <w:p>
             <w:pPr>
               <w:spacing w:after="60"/>
-              <w:rPr>
-                <w:rFonts w:cs="Times New Roman"/>
-              </w:rPr>
             </w:pPr>
             <w:r>
-              <w:rPr>
-                <w:rFonts w:cs="Times New Roman"/>
-              </w:rPr>
               <w:t>Tính kỳ, kiểm tra deadline, kiểm tra trùng đơn, chụp giá, ghi log, trả quyền.</w:t>
             </w:r>
           </w:p>
@@ -12512,10 +12535,10 @@
           <w:rFonts w:cs="Times New Roman"/>
         </w:rPr>
         <w:sectPr>
-          <w:headerReference w:type="default" r:id="rId14"/>
-          <w:footerReference w:type="default" r:id="rId15"/>
-          <w:headerReference w:type="first" r:id="rId16"/>
-          <w:footerReference w:type="first" r:id="rId17"/>
+          <w:headerReference w:type="default" r:id="rId16"/>
+          <w:footerReference w:type="default" r:id="rId17"/>
+          <w:headerReference w:type="first" r:id="rId18"/>
+          <w:footerReference w:type="first" r:id="rId19"/>
           <w:pgSz w:w="11906" w:h="16838"/>
           <w:pgMar w:top="1134" w:right="1134" w:bottom="1134" w:left="1701" w:header="720" w:footer="720" w:gutter="0"/>
           <w:cols w:space="720"/>
@@ -12553,6 +12576,72 @@
         <w:jc w:val="center"/>
         <w:rPr>
           <w:rFonts w:cs="Times New Roman"/>
+          <w:lang w:val="en-GB"/>
+        </w:rPr>
+      </w:pPr>
+      <w:r>
+        <w:rPr>
+          <w:rFonts w:cs="Times New Roman"/>
+          <w:lang w:val="en-GB"/>
+        </w:rPr>
+        <w:lastRenderedPageBreak/>
+        <w:drawing>
+          <wp:inline distT="0" distB="0" distL="0" distR="0" wp14:anchorId="1B78AACC" wp14:editId="15771503">
+            <wp:extent cx="5760085" cy="9128760"/>
+            <wp:effectExtent l="0" t="0" r="0" b="0"/>
+            <wp:docPr id="466092501" name="Picture 11"/>
+            <wp:cNvGraphicFramePr>
+              <a:graphicFrameLocks xmlns:a="http://schemas.openxmlformats.org/drawingml/2006/main" noChangeAspect="1"/>
+            </wp:cNvGraphicFramePr>
+            <a:graphic xmlns:a="http://schemas.openxmlformats.org/drawingml/2006/main">
+              <a:graphicData uri="http://schemas.openxmlformats.org/drawingml/2006/picture">
+                <pic:pic xmlns:pic="http://schemas.openxmlformats.org/drawingml/2006/picture">
+                  <pic:nvPicPr>
+                    <pic:cNvPr id="0" name="Picture 19"/>
+                    <pic:cNvPicPr>
+                      <a:picLocks noChangeAspect="1" noChangeArrowheads="1"/>
+                    </pic:cNvPicPr>
+                  </pic:nvPicPr>
+                  <pic:blipFill>
+                    <a:blip r:embed="rId20" cstate="print">
+                      <a:extLst>
+                        <a:ext uri="{28A0092B-C50C-407E-A947-70E740481C1C}">
+                          <a14:useLocalDpi xmlns:a14="http://schemas.microsoft.com/office/drawing/2010/main" val="0"/>
+                        </a:ext>
+                      </a:extLst>
+                    </a:blip>
+                    <a:srcRect/>
+                    <a:stretch>
+                      <a:fillRect/>
+                    </a:stretch>
+                  </pic:blipFill>
+                  <pic:spPr bwMode="auto">
+                    <a:xfrm>
+                      <a:off x="0" y="0"/>
+                      <a:ext cx="5760085" cy="9128760"/>
+                    </a:xfrm>
+                    <a:prstGeom prst="rect">
+                      <a:avLst/>
+                    </a:prstGeom>
+                    <a:noFill/>
+                    <a:ln>
+                      <a:noFill/>
+                    </a:ln>
+                  </pic:spPr>
+                </pic:pic>
+              </a:graphicData>
+            </a:graphic>
+          </wp:inline>
+        </w:drawing>
+      </w:r>
+    </w:p>
+    <w:p>
+      <w:pPr>
+        <w:keepNext/>
+        <w:spacing w:before="120"/>
+        <w:jc w:val="center"/>
+        <w:rPr>
+          <w:rFonts w:cs="Times New Roman"/>
         </w:rPr>
       </w:pPr>
     </w:p>
@@ -12562,6 +12651,7 @@
         <w:jc w:val="center"/>
         <w:rPr>
           <w:rFonts w:cs="Times New Roman"/>
+          <w:lang w:val="en-US"/>
         </w:rPr>
       </w:pPr>
       <w:r>
@@ -12578,40 +12668,6 @@
           <w:rFonts w:cs="Times New Roman"/>
         </w:rPr>
         <w:t>: Sơ đồ lớp/mô hình dữ liệu chính</w:t>
-      </w:r>
-    </w:p>
-    <w:p>
-      <w:pPr>
-        <w:keepNext/>
-        <w:spacing w:before="120"/>
-        <w:jc w:val="center"/>
-        <w:rPr>
-          <w:rFonts w:cs="Times New Roman"/>
-        </w:rPr>
-      </w:pPr>
-    </w:p>
-    <w:p>
-      <w:pPr>
-        <w:spacing w:before="60"/>
-        <w:jc w:val="center"/>
-        <w:rPr>
-          <w:rFonts w:cs="Times New Roman"/>
-        </w:rPr>
-      </w:pPr>
-      <w:r>
-        <w:rPr>
-          <w:rFonts w:cs="Times New Roman"/>
-          <w:b/>
-          <w:i/>
-          <w:u w:val="single"/>
-        </w:rPr>
-        <w:t>Hình 3-2</w:t>
-      </w:r>
-      <w:r>
-        <w:rPr>
-          <w:rFonts w:cs="Times New Roman"/>
-        </w:rPr>
-        <w:t>: Mô hình dữ liệu chi tiết</w:t>
       </w:r>
     </w:p>
     <w:p>
@@ -12697,12 +12753,10 @@
         <w:tc>
           <w:tcPr>
             <w:tcW w:w="3118" w:type="dxa"/>
-            <w:vAlign w:val="center"/>
           </w:tcPr>
           <w:p>
             <w:pPr>
               <w:spacing w:after="60"/>
-              <w:jc w:val="center"/>
               <w:rPr>
                 <w:rFonts w:cs="Times New Roman"/>
               </w:rPr>
@@ -12718,7 +12772,6 @@
         <w:tc>
           <w:tcPr>
             <w:tcW w:w="5102" w:type="dxa"/>
-            <w:vAlign w:val="center"/>
           </w:tcPr>
           <w:p>
             <w:pPr>
@@ -12743,12 +12796,10 @@
         <w:tc>
           <w:tcPr>
             <w:tcW w:w="3118" w:type="dxa"/>
-            <w:vAlign w:val="center"/>
           </w:tcPr>
           <w:p>
             <w:pPr>
               <w:spacing w:after="60"/>
-              <w:jc w:val="center"/>
               <w:rPr>
                 <w:rFonts w:cs="Times New Roman"/>
               </w:rPr>
@@ -12764,7 +12815,6 @@
         <w:tc>
           <w:tcPr>
             <w:tcW w:w="5102" w:type="dxa"/>
-            <w:vAlign w:val="center"/>
           </w:tcPr>
           <w:p>
             <w:pPr>
@@ -12789,12 +12839,10 @@
         <w:tc>
           <w:tcPr>
             <w:tcW w:w="3118" w:type="dxa"/>
-            <w:vAlign w:val="center"/>
           </w:tcPr>
           <w:p>
             <w:pPr>
               <w:spacing w:after="60"/>
-              <w:jc w:val="center"/>
               <w:rPr>
                 <w:rFonts w:cs="Times New Roman"/>
               </w:rPr>
@@ -12810,7 +12858,6 @@
         <w:tc>
           <w:tcPr>
             <w:tcW w:w="5102" w:type="dxa"/>
-            <w:vAlign w:val="center"/>
           </w:tcPr>
           <w:p>
             <w:pPr>
@@ -12835,12 +12882,10 @@
         <w:tc>
           <w:tcPr>
             <w:tcW w:w="3118" w:type="dxa"/>
-            <w:vAlign w:val="center"/>
           </w:tcPr>
           <w:p>
             <w:pPr>
               <w:spacing w:after="60"/>
-              <w:jc w:val="center"/>
               <w:rPr>
                 <w:rFonts w:cs="Times New Roman"/>
               </w:rPr>
@@ -12856,7 +12901,6 @@
         <w:tc>
           <w:tcPr>
             <w:tcW w:w="5102" w:type="dxa"/>
-            <w:vAlign w:val="center"/>
           </w:tcPr>
           <w:p>
             <w:pPr>
@@ -12881,12 +12925,10 @@
         <w:tc>
           <w:tcPr>
             <w:tcW w:w="3118" w:type="dxa"/>
-            <w:vAlign w:val="center"/>
           </w:tcPr>
           <w:p>
             <w:pPr>
               <w:spacing w:after="60"/>
-              <w:jc w:val="center"/>
               <w:rPr>
                 <w:rFonts w:cs="Times New Roman"/>
               </w:rPr>
@@ -12902,7 +12944,6 @@
         <w:tc>
           <w:tcPr>
             <w:tcW w:w="5102" w:type="dxa"/>
-            <w:vAlign w:val="center"/>
           </w:tcPr>
           <w:p>
             <w:pPr>
@@ -12927,12 +12968,10 @@
         <w:tc>
           <w:tcPr>
             <w:tcW w:w="3118" w:type="dxa"/>
-            <w:vAlign w:val="center"/>
           </w:tcPr>
           <w:p>
             <w:pPr>
               <w:spacing w:after="60"/>
-              <w:jc w:val="center"/>
               <w:rPr>
                 <w:rFonts w:cs="Times New Roman"/>
               </w:rPr>
@@ -12948,7 +12987,6 @@
         <w:tc>
           <w:tcPr>
             <w:tcW w:w="5102" w:type="dxa"/>
-            <w:vAlign w:val="center"/>
           </w:tcPr>
           <w:p>
             <w:pPr>
@@ -12973,12 +13011,10 @@
         <w:tc>
           <w:tcPr>
             <w:tcW w:w="3118" w:type="dxa"/>
-            <w:vAlign w:val="center"/>
           </w:tcPr>
           <w:p>
             <w:pPr>
               <w:spacing w:after="60"/>
-              <w:jc w:val="center"/>
               <w:rPr>
                 <w:rFonts w:cs="Times New Roman"/>
               </w:rPr>
@@ -12994,7 +13030,6 @@
         <w:tc>
           <w:tcPr>
             <w:tcW w:w="5102" w:type="dxa"/>
-            <w:vAlign w:val="center"/>
           </w:tcPr>
           <w:p>
             <w:pPr>
@@ -13020,7 +13055,6 @@
       </w:pPr>
       <w:bookmarkStart w:id="26" w:name="_Toc233531578"/>
       <w:r>
-        <w:lastRenderedPageBreak/>
         <w:t>3.2 MÔ HÌNH XỬ LÝ</w:t>
       </w:r>
       <w:bookmarkEnd w:id="26"/>
@@ -13637,7 +13671,6 @@
               <w:rPr>
                 <w:rFonts w:cs="Times New Roman"/>
               </w:rPr>
-              <w:lastRenderedPageBreak/>
               <w:t>UC-02</w:t>
             </w:r>
           </w:p>
@@ -13956,6 +13989,7 @@
               <w:rPr>
                 <w:rFonts w:cs="Times New Roman"/>
               </w:rPr>
+              <w:lastRenderedPageBreak/>
               <w:t>UC-05</w:t>
             </w:r>
           </w:p>
@@ -14504,7 +14538,14 @@
               <w:rPr>
                 <w:rFonts w:cs="Times New Roman"/>
               </w:rPr>
-              <w:t>Page_OrderCreate, VPPRequestController, VPPRequestService, SQL Server</w:t>
+              <w:t xml:space="preserve">Page_OrderCreate, VPPRequestController, </w:t>
+            </w:r>
+            <w:r>
+              <w:rPr>
+                <w:rFonts w:cs="Times New Roman"/>
+              </w:rPr>
+              <w:lastRenderedPageBreak/>
+              <w:t>VPPRequestService, SQL Server</w:t>
             </w:r>
           </w:p>
         </w:tc>
@@ -14524,7 +14565,15 @@
               <w:rPr>
                 <w:rFonts w:cs="Times New Roman"/>
               </w:rPr>
-              <w:t>Frontend tải kỳ hiện tại và danh mục; người dùng gửi đơn; backend kiểm tra kỳ, trùng đơn, item hợp lệ; lưu header/detail/log trong transaction.</w:t>
+              <w:lastRenderedPageBreak/>
+              <w:t xml:space="preserve">Frontend tải kỳ hiện tại và danh mục; người dùng gửi đơn; backend kiểm tra kỳ, trùng đơn, item hợp lệ; </w:t>
+            </w:r>
+            <w:r>
+              <w:rPr>
+                <w:rFonts w:cs="Times New Roman"/>
+              </w:rPr>
+              <w:lastRenderedPageBreak/>
+              <w:t>lưu header/detail/log trong transaction.</w:t>
             </w:r>
           </w:p>
         </w:tc>
@@ -14550,6 +14599,7 @@
               <w:rPr>
                 <w:rFonts w:cs="Times New Roman"/>
               </w:rPr>
+              <w:lastRenderedPageBreak/>
               <w:t>Duyệt đơn bổ sung</w:t>
             </w:r>
           </w:p>
@@ -14930,6 +14980,7 @@
       </w:pPr>
       <w:bookmarkStart w:id="30" w:name="_Toc233531582"/>
       <w:r>
+        <w:lastRenderedPageBreak/>
         <w:t>3.3 HỆ THỐNG MÀN HÌNH</w:t>
       </w:r>
       <w:bookmarkEnd w:id="30"/>
@@ -15251,7 +15302,6 @@
         <w:rPr>
           <w:rFonts w:cs="Times New Roman"/>
         </w:rPr>
-        <w:lastRenderedPageBreak/>
         <w:t>Giao diện hệ thống được tổ chức theo mô hình ứng dụng quản trị nội bộ, ưu tiên khả năng thao tác lặp lại, lọc dữ liệu, phân trang và hiển thị trạng thái. Các màn hình chính gồm Dashboard, Library, Permission và Report.</w:t>
       </w:r>
     </w:p>
@@ -15286,10 +15336,10 @@
           <w:rFonts w:cs="Times New Roman"/>
         </w:rPr>
         <w:sectPr>
-          <w:headerReference w:type="default" r:id="rId18"/>
-          <w:footerReference w:type="default" r:id="rId19"/>
-          <w:headerReference w:type="first" r:id="rId20"/>
-          <w:footerReference w:type="first" r:id="rId21"/>
+          <w:headerReference w:type="default" r:id="rId21"/>
+          <w:footerReference w:type="default" r:id="rId22"/>
+          <w:headerReference w:type="first" r:id="rId23"/>
+          <w:footerReference w:type="first" r:id="rId24"/>
           <w:pgSz w:w="11906" w:h="16838"/>
           <w:pgMar w:top="1134" w:right="1134" w:bottom="1134" w:left="1701" w:header="720" w:footer="720" w:gutter="0"/>
           <w:cols w:space="720"/>
@@ -16189,10 +16239,10 @@
           <w:rFonts w:cs="Times New Roman"/>
         </w:rPr>
         <w:sectPr>
-          <w:headerReference w:type="default" r:id="rId22"/>
-          <w:footerReference w:type="default" r:id="rId23"/>
-          <w:headerReference w:type="first" r:id="rId24"/>
-          <w:footerReference w:type="first" r:id="rId25"/>
+          <w:headerReference w:type="default" r:id="rId25"/>
+          <w:footerReference w:type="default" r:id="rId26"/>
+          <w:headerReference w:type="first" r:id="rId27"/>
+          <w:footerReference w:type="first" r:id="rId28"/>
           <w:pgSz w:w="11906" w:h="16838"/>
           <w:pgMar w:top="1134" w:right="1134" w:bottom="1134" w:left="1701" w:header="720" w:footer="720" w:gutter="0"/>
           <w:cols w:space="720"/>
@@ -16834,10 +16884,10 @@
           <w:rFonts w:cs="Times New Roman"/>
         </w:rPr>
         <w:sectPr>
-          <w:headerReference w:type="default" r:id="rId26"/>
-          <w:footerReference w:type="default" r:id="rId27"/>
-          <w:headerReference w:type="first" r:id="rId28"/>
-          <w:footerReference w:type="first" r:id="rId29"/>
+          <w:headerReference w:type="default" r:id="rId29"/>
+          <w:footerReference w:type="default" r:id="rId30"/>
+          <w:headerReference w:type="first" r:id="rId31"/>
+          <w:footerReference w:type="first" r:id="rId32"/>
           <w:pgSz w:w="11906" w:h="16838"/>
           <w:pgMar w:top="1134" w:right="1134" w:bottom="1134" w:left="1701" w:header="720" w:footer="720" w:gutter="0"/>
           <w:cols w:space="720"/>
@@ -17101,10 +17151,10 @@
           <w:rFonts w:cs="Times New Roman"/>
         </w:rPr>
         <w:sectPr>
-          <w:headerReference w:type="default" r:id="rId30"/>
-          <w:footerReference w:type="default" r:id="rId31"/>
-          <w:headerReference w:type="first" r:id="rId32"/>
-          <w:footerReference w:type="first" r:id="rId33"/>
+          <w:headerReference w:type="default" r:id="rId33"/>
+          <w:footerReference w:type="default" r:id="rId34"/>
+          <w:headerReference w:type="first" r:id="rId35"/>
+          <w:footerReference w:type="first" r:id="rId36"/>
           <w:pgSz w:w="11906" w:h="16838"/>
           <w:pgMar w:top="1134" w:right="1134" w:bottom="1134" w:left="1701" w:header="720" w:footer="720" w:gutter="0"/>
           <w:cols w:space="720"/>
@@ -17267,10 +17317,10 @@
       </w:r>
     </w:p>
     <w:sectPr>
-      <w:headerReference w:type="default" r:id="rId34"/>
-      <w:footerReference w:type="default" r:id="rId35"/>
-      <w:headerReference w:type="first" r:id="rId36"/>
-      <w:footerReference w:type="first" r:id="rId37"/>
+      <w:headerReference w:type="default" r:id="rId37"/>
+      <w:footerReference w:type="default" r:id="rId38"/>
+      <w:headerReference w:type="first" r:id="rId39"/>
+      <w:footerReference w:type="first" r:id="rId40"/>
       <w:pgSz w:w="11906" w:h="16838"/>
       <w:pgMar w:top="1134" w:right="1134" w:bottom="1134" w:left="1701" w:header="720" w:footer="720" w:gutter="0"/>
       <w:cols w:space="720"/>
@@ -26277,7 +26327,6 @@
   <w:style w:type="character" w:default="1" w:styleId="DefaultParagraphFont">
     <w:name w:val="Default Paragraph Font"/>
     <w:uiPriority w:val="1"/>
-    <w:semiHidden/>
     <w:unhideWhenUsed/>
   </w:style>
   <w:style w:type="table" w:default="1" w:styleId="TableNormal">
@@ -27339,28 +27388,28 @@
 </file>
 
 <file path=customXml/item1.xml><?xml version="1.0" encoding="utf-8"?>
-<b:Sources xmlns:b="http://schemas.openxmlformats.org/officeDocument/2006/bibliography" xmlns="http://schemas.openxmlformats.org/officeDocument/2006/bibliography" SelectedStyle="\APASixthEditionOfficeOnline.xsl" StyleName="APA" Version="6"/>
-</file>
-
-<file path=customXml/item2.xml><?xml version="1.0" encoding="utf-8"?>
 <go:gDocsCustomXmlDataStorage xmlns:go="http://customooxmlschemas.google.com/" xmlns:r="http://schemas.openxmlformats.org/officeDocument/2006/relationships" uri="GoogleDocsCustomDataVersion2">
   <go:docsCustomData xmlns:go="http://customooxmlschemas.google.com/" roundtripDataSignature="AMtx7mg7Q0Uq/043h0wNKjJjzxNnYO4FZg==">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</go:docsCustomData>
 </go:gDocsCustomXmlDataStorage>
 </file>
 
-<file path=customXml/itemProps1.xml><?xml version="1.0" encoding="utf-8"?>
-<ds:datastoreItem xmlns:ds="http://schemas.openxmlformats.org/officeDocument/2006/customXml" ds:itemID="{B04E8E24-E027-4FCC-8400-D21D80D6420F}">
-  <ds:schemaRefs>
-    <ds:schemaRef ds:uri="http://schemas.openxmlformats.org/officeDocument/2006/bibliography"/>
-  </ds:schemaRefs>
-</ds:datastoreItem>
+<file path=customXml/item2.xml><?xml version="1.0" encoding="utf-8"?>
+<b:Sources xmlns:b="http://schemas.openxmlformats.org/officeDocument/2006/bibliography" xmlns="http://schemas.openxmlformats.org/officeDocument/2006/bibliography" SelectedStyle="\APASixthEditionOfficeOnline.xsl" StyleName="APA" Version="6"/>
 </file>
 
-<file path=customXml/itemProps2.xml><?xml version="1.0" encoding="utf-8"?>
+<file path=customXml/itemProps1.xml><?xml version="1.0" encoding="utf-8"?>
 <ds:datastoreItem xmlns:ds="http://schemas.openxmlformats.org/officeDocument/2006/customXml" ds:itemID="{11111111-1234-1234-1234-123412341234}">
   <ds:schemaRefs>
     <ds:schemaRef ds:uri="http://customooxmlschemas.google.com/"/>
     <ds:schemaRef ds:uri="http://schemas.openxmlformats.org/officeDocument/2006/relationships"/>
   </ds:schemaRefs>
 </ds:datastoreItem>
+</file>
+
+<file path=customXml/itemProps2.xml><?xml version="1.0" encoding="utf-8"?>
+<ds:datastoreItem xmlns:ds="http://schemas.openxmlformats.org/officeDocument/2006/customXml" ds:itemID="{B04E8E24-E027-4FCC-8400-D21D80D6420F}">
+  <ds:schemaRefs>
+    <ds:schemaRef ds:uri="http://schemas.openxmlformats.org/officeDocument/2006/bibliography"/>
+  </ds:schemaRefs>
+</ds:datastoreItem>
 </file>
</xml_diff>